<commit_message>
Move the purchase request justification onto a second page for duplex printing
</commit_message>
<xml_diff>
--- a/resources/templates/purchase_request.docx
+++ b/resources/templates/purchase_request.docx
@@ -831,17 +831,37 @@
     </w:p>
     <w:p>
       <w:pPr>
+        <w:pageBreakBefore/>
         <w:rPr>
           <w:rFonts w:ascii="Times New Roman" w:hAnsi="Times New Roman" w:cs="Times New Roman"/>
-          <w:sz w:val="20"/>
-          <w:szCs w:val="20"/>
+          <w:b/>
+          <w:sz w:val="24"/>
+          <w:szCs w:val="24"/>
         </w:rPr>
       </w:pPr>
       <w:r>
         <w:rPr>
           <w:rFonts w:ascii="Times New Roman" w:hAnsi="Times New Roman" w:cs="Times New Roman"/>
-          <w:sz w:val="20"/>
-          <w:szCs w:val="20"/>
+          <w:b/>
+          <w:sz w:val="24"/>
+          <w:szCs w:val="24"/>
+        </w:rPr>
+        <w:t xml:space="preserve">Обоснование приобретения:</w:t>
+      </w:r>
+    </w:p>
+    <w:p>
+      <w:pPr>
+        <w:rPr>
+          <w:rFonts w:ascii="Times New Roman" w:hAnsi="Times New Roman" w:cs="Times New Roman"/>
+          <w:sz w:val="24"/>
+          <w:szCs w:val="24"/>
+        </w:rPr>
+      </w:pPr>
+      <w:r>
+        <w:rPr>
+          <w:rFonts w:ascii="Times New Roman" w:hAnsi="Times New Roman" w:cs="Times New Roman"/>
+          <w:sz w:val="24"/>
+          <w:szCs w:val="24"/>
         </w:rPr>
         <w:t xml:space="preserve">${purpose}</w:t>
       </w:r>

</xml_diff>